<commit_message>
Drop the compare-to-other-courses sentence from the Hebrew rationale
Removed the closing line ("similar ML courses exist but no dedicated DL
foundation course as a bridge..."), which both compared to other courses and
reintroduced the gateway framing the rationale was repositioned away from.

Co-Authored-By: Claude Opus 4.8 <noreply@anthropic.com>
</commit_message>
<xml_diff>
--- a/hit-catalogue/rationale.docx
+++ b/hit-catalogue/rationale.docx
@@ -95,22 +95,6 @@
           <w:rtl/>
         </w:rPr>
         <w:t>הקורס סוגר פער קיים בתכנית הלימודים: הוא מספק את הבסיס המשותף בלמידה עמוקה הנדרש לקורסי ההמשך, ומקנה עבודה מעשית עם כלי בינה מלאכותית מודרניים תוך שמירה על למידה אמיתית של החומר, כך שהסטודנט נדרש לחזות, להסביר ולהגן על עבודתו.</w:t>
-      </w:r>
-    </w:p>
-    <w:p>
-      <w:pPr>
-        <w:bidi/>
-        <w:spacing w:after="120"/>
-        <w:jc w:val="both"/>
-      </w:pPr>
-      <w:r>
-        <w:rPr>
-          <w:rFonts w:ascii="Arial" w:hAnsi="Arial" w:cs="Arial"/>
-          <w:b w:val="0"/>
-          <w:sz w:val="22"/>
-          <w:rtl/>
-        </w:rPr>
-        <w:t>קיימים במכון קורסים משיקים בלמידת מכונה, אך אין קורס יסוד ייעודי בלמידה עמוקה המשמש גשר מסודר לקורסי ההמשך המתקדמים.</w:t>
       </w:r>
     </w:p>
     <w:sectPr>

</xml_diff>